<commit_message>
fix(informe): el cronograma pasa a seccion propia, ordenado y con año
El usuario no encontraba el cronograma. Estaba, pero enterrado como una tabla
sin titulo dentro de la seccion 3, y con dos defectos reales:

  - Las filas NO estaban en orden de fecha: 23 sep aparecia antes que 19 sep.
  - Las fechas no llevaban el año.

Corregido:
  - Seccion propia '4 · En qué tiempo: cronograma comprometido'.
  - Filas ordenadas: 4 sep, 9 sep, 19 sep, 23 sep, 28 sep, 10 oct, 24 oct.
  - Fecha como primera columna, con año, y columna de estado PLANIFICADA.

Los titulos de las secciones 1 a 4 reproducen ahora literalmente la pregunta del
docente -lo que esta listo, lo que no, como se va a abordar y en que tiempo-
para que se reconozcan de un vistazo sin leer el cuerpo.

Aplicado tambien al .md fuente. 3,7 pp, dentro del 2-4 exigido.

Co-Authored-By: Claude Opus 5 <noreply@anthropic.com>
Claude-Session: https://claude.ai/code/session_0118CSEqQvxD2LbN5hkqoZC6
</commit_message>
<xml_diff>
--- a/docs/entregables/01-evaluacion-critica/Informe-evaluacion-critica.docx
+++ b/docs/entregables/01-evaluacion-critica/Informe-evaluacion-critica.docx
@@ -158,7 +158,7 @@
           <w:color w:val="1F4E79"/>
           <w:sz w:val="25"/>
         </w:rPr>
-        <w:t>1 ·  Qué se abordó de manera objetiva</w:t>
+        <w:t>1 ·  Lo que está listo: qué se abordó de manera objetiva</w:t>
       </w:r>
     </w:p>
     <w:p>
@@ -1598,7 +1598,7 @@
           <w:color w:val="1F4E79"/>
           <w:sz w:val="25"/>
         </w:rPr>
-        <w:t>2 ·  Qué está faltando</w:t>
+        <w:t>2 ·  Lo que NO está listo: qué está faltando</w:t>
       </w:r>
     </w:p>
     <w:p>
@@ -2249,7 +2249,7 @@
           <w:color w:val="1F4E79"/>
           <w:sz w:val="25"/>
         </w:rPr>
-        <w:t>3 ·  Cómo se está abordando lo que falta</w:t>
+        <w:t>3 ·  Cómo se va a abordar lo que falta</w:t>
       </w:r>
     </w:p>
     <w:p>
@@ -2732,6 +2732,19 @@
     </w:p>
     <w:p>
       <w:pPr>
+        <w:spacing w:before="220" w:after="80"/>
+      </w:pPr>
+      <w:r>
+        <w:rPr>
+          <w:b/>
+          <w:color w:val="1F4E79"/>
+          <w:sz w:val="25"/>
+        </w:rPr>
+        <w:t>4 ·  En qué tiempo: cronograma comprometido</w:t>
+      </w:r>
+    </w:p>
+    <w:p>
+      <w:pPr>
         <w:spacing w:after="100"/>
         <w:jc w:val="both"/>
       </w:pPr>
@@ -2742,6 +2755,7 @@
           <w:color w:val="131B2E"/>
           <w:sz w:val="18"/>
         </w:rPr>
+        <w:t xml:space="preserve">*Propuesta del equipo del 2 de septiembre de 2026, pendiente del visto bueno de los asesores.* </w:t>
       </w:r>
       <w:r>
         <w:rPr>
@@ -2750,7 +2764,7 @@
           <w:color w:val="131B2E"/>
           <w:sz w:val="18"/>
         </w:rPr>
-        <w:t>La fecha que ordena el cronograma es el 30 de septiembre de 2026:</w:t>
+        <w:t>La fecha que ordena todo es el 30 de septiembre de 2026:</w:t>
       </w:r>
       <w:r>
         <w:rPr>
@@ -2759,7 +2773,7 @@
           <w:color w:val="131B2E"/>
           <w:sz w:val="18"/>
         </w:rPr>
-        <w:t xml:space="preserve"> IJIES sube su APC de USD 300 a USD 400 el 1 de octubre, y el cargo lo asume la Universidad Peruana Unión. Con la mediana medida de la revista —41 días a la primera decisión, 158 hasta publicar—, un envío el 28 de septiembre proyecta decisión hacia el 8 de noviembre de 2026 y publicación hacia marzo de 2027. Todo lo que alimenta la sección de resultados se cierra antes de esa fecha; lo demás va después.</w:t>
+        <w:t xml:space="preserve"> IJIES sube su APC de USD 300 a USD 400 el 1 de octubre y el cargo lo asume la Universidad Peruana Unión, así que enviar antes ahorra USD 100 institucionales. Con la mediana medida de la revista —41 días a la primera decisión, 158 hasta publicar—, un envío el 28 de septiembre proyecta decisión hacia el 8 de noviembre de 2026 y publicación hacia marzo de 2027.</w:t>
       </w:r>
     </w:p>
     <w:tbl>
@@ -2778,15 +2792,33 @@
         </w:tblBorders>
       </w:tblPr>
       <w:tblGrid>
-        <w:gridCol w:w="2550"/>
-        <w:gridCol w:w="2550"/>
-        <w:gridCol w:w="2550"/>
-        <w:gridCol w:w="2550"/>
+        <w:gridCol w:w="2040"/>
+        <w:gridCol w:w="2040"/>
+        <w:gridCol w:w="2040"/>
+        <w:gridCol w:w="2040"/>
+        <w:gridCol w:w="2040"/>
       </w:tblGrid>
       <w:tr>
         <w:tc>
           <w:tcPr>
-            <w:tcW w:type="dxa" w:w="2494"/>
+            <w:tcW w:type="dxa" w:w="1644"/>
+            <w:shd w:val="clear" w:fill="1F4E79"/>
+          </w:tcPr>
+          <w:p>
+            <w:r/>
+            <w:r>
+              <w:rPr>
+                <w:b/>
+                <w:color w:val="FFFFFF"/>
+                <w:sz w:val="16"/>
+              </w:rPr>
+              <w:t>Fecha</w:t>
+            </w:r>
+          </w:p>
+        </w:tc>
+        <w:tc>
+          <w:tcPr>
+            <w:tcW w:type="dxa" w:w="2268"/>
             <w:shd w:val="clear" w:fill="1F4E79"/>
           </w:tcPr>
           <w:p>
@@ -2803,7 +2835,7 @@
         </w:tc>
         <w:tc>
           <w:tcPr>
-            <w:tcW w:type="dxa" w:w="3515"/>
+            <w:tcW w:type="dxa" w:w="3175"/>
             <w:shd w:val="clear" w:fill="1F4E79"/>
           </w:tcPr>
           <w:p>
@@ -2820,7 +2852,7 @@
         </w:tc>
         <w:tc>
           <w:tcPr>
-            <w:tcW w:type="dxa" w:w="1644"/>
+            <w:tcW w:type="dxa" w:w="1361"/>
             <w:shd w:val="clear" w:fill="1F4E79"/>
           </w:tcPr>
           <w:p>
@@ -2837,7 +2869,7 @@
         </w:tc>
         <w:tc>
           <w:tcPr>
-            <w:tcW w:type="dxa" w:w="1417"/>
+            <w:tcW w:type="dxa" w:w="1304"/>
             <w:shd w:val="clear" w:fill="1F4E79"/>
           </w:tcPr>
           <w:p>
@@ -2848,7 +2880,7 @@
                 <w:color w:val="FFFFFF"/>
                 <w:sz w:val="16"/>
               </w:rPr>
-              <w:t>Fecha</w:t>
+              <w:t>Estado</w:t>
             </w:r>
           </w:p>
         </w:tc>
@@ -2856,67 +2888,7 @@
       <w:tr>
         <w:tc>
           <w:tcPr>
-            <w:tcW w:type="dxa" w:w="2494"/>
-            <w:shd w:val="clear" w:fill="EEF3FA"/>
-          </w:tcPr>
-          <w:p>
-            <w:pPr>
-              <w:spacing w:after="20"/>
-            </w:pPr>
-            <w:r/>
-            <w:r>
-              <w:rPr>
-                <w:b w:val="0"/>
-                <w:color w:val="131B2E"/>
-                <w:sz w:val="16"/>
-              </w:rPr>
-              <w:t>Declarar la selección posterior en la tesis</w:t>
-            </w:r>
-          </w:p>
-        </w:tc>
-        <w:tc>
-          <w:tcPr>
-            <w:tcW w:type="dxa" w:w="3515"/>
-            <w:shd w:val="clear" w:fill="EEF3FA"/>
-          </w:tcPr>
-          <w:p>
-            <w:pPr>
-              <w:spacing w:after="20"/>
-            </w:pPr>
-            <w:r/>
-            <w:r>
-              <w:rPr>
-                <w:b w:val="0"/>
-                <w:color w:val="131B2E"/>
-                <w:sz w:val="16"/>
-              </w:rPr>
-              <w:t>Párrafo en metodología, enlazado a la *model card*</w:t>
-            </w:r>
-          </w:p>
-        </w:tc>
-        <w:tc>
-          <w:tcPr>
             <w:tcW w:type="dxa" w:w="1644"/>
-            <w:shd w:val="clear" w:fill="EEF3FA"/>
-          </w:tcPr>
-          <w:p>
-            <w:pPr>
-              <w:spacing w:after="20"/>
-            </w:pPr>
-            <w:r/>
-            <w:r>
-              <w:rPr>
-                <w:b w:val="0"/>
-                <w:color w:val="131B2E"/>
-                <w:sz w:val="16"/>
-              </w:rPr>
-              <w:t>Salazar</w:t>
-            </w:r>
-          </w:p>
-        </w:tc>
-        <w:tc>
-          <w:tcPr>
-            <w:tcW w:type="dxa" w:w="1417"/>
             <w:shd w:val="clear" w:fill="EEF3FA"/>
           </w:tcPr>
           <w:p>
@@ -2937,7 +2909,7 @@
                 <w:color w:val="131B2E"/>
                 <w:sz w:val="16"/>
               </w:rPr>
-              <w:t>vie 4 sep</w:t>
+              <w:t>vie 4 sep 2026</w:t>
             </w:r>
             <w:r>
               <w:rPr>
@@ -2948,11 +2920,124 @@
             </w:r>
           </w:p>
         </w:tc>
+        <w:tc>
+          <w:tcPr>
+            <w:tcW w:type="dxa" w:w="2268"/>
+            <w:shd w:val="clear" w:fill="EEF3FA"/>
+          </w:tcPr>
+          <w:p>
+            <w:pPr>
+              <w:spacing w:after="20"/>
+            </w:pPr>
+            <w:r/>
+            <w:r>
+              <w:rPr>
+                <w:b w:val="0"/>
+                <w:color w:val="131B2E"/>
+                <w:sz w:val="16"/>
+              </w:rPr>
+              <w:t>Declarar la selección posterior en la tesis</w:t>
+            </w:r>
+          </w:p>
+        </w:tc>
+        <w:tc>
+          <w:tcPr>
+            <w:tcW w:type="dxa" w:w="3175"/>
+            <w:shd w:val="clear" w:fill="EEF3FA"/>
+          </w:tcPr>
+          <w:p>
+            <w:pPr>
+              <w:spacing w:after="20"/>
+            </w:pPr>
+            <w:r/>
+            <w:r>
+              <w:rPr>
+                <w:b w:val="0"/>
+                <w:color w:val="131B2E"/>
+                <w:sz w:val="16"/>
+              </w:rPr>
+              <w:t>Párrafo en metodología, enlazado a la *model card*</w:t>
+            </w:r>
+          </w:p>
+        </w:tc>
+        <w:tc>
+          <w:tcPr>
+            <w:tcW w:type="dxa" w:w="1361"/>
+            <w:shd w:val="clear" w:fill="EEF3FA"/>
+          </w:tcPr>
+          <w:p>
+            <w:pPr>
+              <w:spacing w:after="20"/>
+            </w:pPr>
+            <w:r/>
+            <w:r>
+              <w:rPr>
+                <w:b w:val="0"/>
+                <w:color w:val="131B2E"/>
+                <w:sz w:val="16"/>
+              </w:rPr>
+              <w:t>Salazar</w:t>
+            </w:r>
+          </w:p>
+        </w:tc>
+        <w:tc>
+          <w:tcPr>
+            <w:tcW w:type="dxa" w:w="1304"/>
+            <w:shd w:val="clear" w:fill="EEF3FA"/>
+          </w:tcPr>
+          <w:p>
+            <w:pPr>
+              <w:spacing w:after="20"/>
+            </w:pPr>
+            <w:r/>
+            <w:r>
+              <w:rPr>
+                <w:b w:val="0"/>
+                <w:color w:val="131B2E"/>
+                <w:sz w:val="16"/>
+              </w:rPr>
+              <w:t>PLANIFICADA</w:t>
+            </w:r>
+          </w:p>
+        </w:tc>
       </w:tr>
       <w:tr>
         <w:tc>
           <w:tcPr>
-            <w:tcW w:type="dxa" w:w="2494"/>
+            <w:tcW w:type="dxa" w:w="1644"/>
+          </w:tcPr>
+          <w:p>
+            <w:pPr>
+              <w:spacing w:after="20"/>
+            </w:pPr>
+            <w:r/>
+            <w:r>
+              <w:rPr>
+                <w:b w:val="0"/>
+                <w:color w:val="131B2E"/>
+                <w:sz w:val="16"/>
+              </w:rPr>
+            </w:r>
+            <w:r>
+              <w:rPr>
+                <w:b/>
+                <w:color w:val="131B2E"/>
+                <w:sz w:val="16"/>
+              </w:rPr>
+              <w:t>mié 9 sep 2026</w:t>
+            </w:r>
+            <w:r>
+              <w:rPr>
+                <w:b w:val="0"/>
+                <w:color w:val="131B2E"/>
+                <w:sz w:val="16"/>
+              </w:rPr>
+            </w:r>
+          </w:p>
+        </w:tc>
+        <w:tc>
+          <w:tcPr>
+            <w:tcW w:type="dxa" w:w="2268"/>
           </w:tcPr>
           <w:p>
             <w:pPr>
@@ -2985,7 +3070,7 @@
         </w:tc>
         <w:tc>
           <w:tcPr>
-            <w:tcW w:type="dxa" w:w="3515"/>
+            <w:tcW w:type="dxa" w:w="3175"/>
           </w:tcPr>
           <w:p>
             <w:pPr>
@@ -3004,7 +3089,7 @@
         </w:tc>
         <w:tc>
           <w:tcPr>
-            <w:tcW w:type="dxa" w:w="1644"/>
+            <w:tcW w:type="dxa" w:w="1361"/>
           </w:tcPr>
           <w:p>
             <w:pPr>
@@ -3023,7 +3108,7 @@
         </w:tc>
         <w:tc>
           <w:tcPr>
-            <w:tcW w:type="dxa" w:w="1417"/>
+            <w:tcW w:type="dxa" w:w="1304"/>
           </w:tcPr>
           <w:p>
             <w:pPr>
@@ -3036,21 +3121,7 @@
                 <w:color w:val="131B2E"/>
                 <w:sz w:val="16"/>
               </w:rPr>
-            </w:r>
-            <w:r>
-              <w:rPr>
-                <w:b/>
-                <w:color w:val="131B2E"/>
-                <w:sz w:val="16"/>
-              </w:rPr>
-              <w:t>mié 9 sep</w:t>
-            </w:r>
-            <w:r>
-              <w:rPr>
-                <w:b w:val="0"/>
-                <w:color w:val="131B2E"/>
-                <w:sz w:val="16"/>
-              </w:rPr>
+              <w:t>PLANIFICADA</w:t>
             </w:r>
           </w:p>
         </w:tc>
@@ -3058,67 +3129,7 @@
       <w:tr>
         <w:tc>
           <w:tcPr>
-            <w:tcW w:type="dxa" w:w="2494"/>
-            <w:shd w:val="clear" w:fill="EEF3FA"/>
-          </w:tcPr>
-          <w:p>
-            <w:pPr>
-              <w:spacing w:after="20"/>
-            </w:pPr>
-            <w:r/>
-            <w:r>
-              <w:rPr>
-                <w:b w:val="0"/>
-                <w:color w:val="131B2E"/>
-                <w:sz w:val="16"/>
-              </w:rPr>
-              <w:t>Juicio experto (3 evaluadores)</w:t>
-            </w:r>
-          </w:p>
-        </w:tc>
-        <w:tc>
-          <w:tcPr>
-            <w:tcW w:type="dxa" w:w="3515"/>
-            <w:shd w:val="clear" w:fill="EEF3FA"/>
-          </w:tcPr>
-          <w:p>
-            <w:pPr>
-              <w:spacing w:after="20"/>
-            </w:pPr>
-            <w:r/>
-            <w:r>
-              <w:rPr>
-                <w:b w:val="0"/>
-                <w:color w:val="131B2E"/>
-                <w:sz w:val="16"/>
-              </w:rPr>
-              <w:t>Rúbrica de pertinencia, ya con los resultados del SUS a la vista</w:t>
-            </w:r>
-          </w:p>
-        </w:tc>
-        <w:tc>
-          <w:tcPr>
             <w:tcW w:type="dxa" w:w="1644"/>
-            <w:shd w:val="clear" w:fill="EEF3FA"/>
-          </w:tcPr>
-          <w:p>
-            <w:pPr>
-              <w:spacing w:after="20"/>
-            </w:pPr>
-            <w:r/>
-            <w:r>
-              <w:rPr>
-                <w:b w:val="0"/>
-                <w:color w:val="131B2E"/>
-                <w:sz w:val="16"/>
-              </w:rPr>
-              <w:t>Salazar · asesores</w:t>
-            </w:r>
-          </w:p>
-        </w:tc>
-        <w:tc>
-          <w:tcPr>
-            <w:tcW w:type="dxa" w:w="1417"/>
             <w:shd w:val="clear" w:fill="EEF3FA"/>
           </w:tcPr>
           <w:p>
@@ -3139,7 +3150,7 @@
                 <w:color w:val="131B2E"/>
                 <w:sz w:val="16"/>
               </w:rPr>
-              <w:t>mié 23 sep</w:t>
+              <w:t>sáb 19 sep 2026</w:t>
             </w:r>
             <w:r>
               <w:rPr>
@@ -3150,11 +3161,10 @@
             </w:r>
           </w:p>
         </w:tc>
-      </w:tr>
-      <w:tr>
         <w:tc>
           <w:tcPr>
-            <w:tcW w:type="dxa" w:w="2494"/>
+            <w:tcW w:type="dxa" w:w="2268"/>
+            <w:shd w:val="clear" w:fill="EEF3FA"/>
           </w:tcPr>
           <w:p>
             <w:pPr>
@@ -3173,7 +3183,8 @@
         </w:tc>
         <w:tc>
           <w:tcPr>
-            <w:tcW w:type="dxa" w:w="3515"/>
+            <w:tcW w:type="dxa" w:w="3175"/>
+            <w:shd w:val="clear" w:fill="EEF3FA"/>
           </w:tcPr>
           <w:p>
             <w:pPr>
@@ -3192,7 +3203,8 @@
         </w:tc>
         <w:tc>
           <w:tcPr>
-            <w:tcW w:type="dxa" w:w="1644"/>
+            <w:tcW w:type="dxa" w:w="1361"/>
+            <w:shd w:val="clear" w:fill="EEF3FA"/>
           </w:tcPr>
           <w:p>
             <w:pPr>
@@ -3211,7 +3223,29 @@
         </w:tc>
         <w:tc>
           <w:tcPr>
-            <w:tcW w:type="dxa" w:w="1417"/>
+            <w:tcW w:type="dxa" w:w="1304"/>
+            <w:shd w:val="clear" w:fill="EEF3FA"/>
+          </w:tcPr>
+          <w:p>
+            <w:pPr>
+              <w:spacing w:after="20"/>
+            </w:pPr>
+            <w:r/>
+            <w:r>
+              <w:rPr>
+                <w:b w:val="0"/>
+                <w:color w:val="131B2E"/>
+                <w:sz w:val="16"/>
+              </w:rPr>
+              <w:t>PLANIFICADA</w:t>
+            </w:r>
+          </w:p>
+        </w:tc>
+      </w:tr>
+      <w:tr>
+        <w:tc>
+          <w:tcPr>
+            <w:tcW w:type="dxa" w:w="1644"/>
           </w:tcPr>
           <w:p>
             <w:pPr>
@@ -3231,7 +3265,7 @@
                 <w:color w:val="131B2E"/>
                 <w:sz w:val="16"/>
               </w:rPr>
-              <w:t>sáb 19 sep</w:t>
+              <w:t>mié 23 sep 2026</w:t>
             </w:r>
             <w:r>
               <w:rPr>
@@ -3242,11 +3276,121 @@
             </w:r>
           </w:p>
         </w:tc>
+        <w:tc>
+          <w:tcPr>
+            <w:tcW w:type="dxa" w:w="2268"/>
+          </w:tcPr>
+          <w:p>
+            <w:pPr>
+              <w:spacing w:after="20"/>
+            </w:pPr>
+            <w:r/>
+            <w:r>
+              <w:rPr>
+                <w:b w:val="0"/>
+                <w:color w:val="131B2E"/>
+                <w:sz w:val="16"/>
+              </w:rPr>
+              <w:t>Juicio experto (3 evaluadores)</w:t>
+            </w:r>
+          </w:p>
+        </w:tc>
+        <w:tc>
+          <w:tcPr>
+            <w:tcW w:type="dxa" w:w="3175"/>
+          </w:tcPr>
+          <w:p>
+            <w:pPr>
+              <w:spacing w:after="20"/>
+            </w:pPr>
+            <w:r/>
+            <w:r>
+              <w:rPr>
+                <w:b w:val="0"/>
+                <w:color w:val="131B2E"/>
+                <w:sz w:val="16"/>
+              </w:rPr>
+              <w:t>Rúbrica de pertinencia, ya con los resultados del SUS a la vista</w:t>
+            </w:r>
+          </w:p>
+        </w:tc>
+        <w:tc>
+          <w:tcPr>
+            <w:tcW w:type="dxa" w:w="1361"/>
+          </w:tcPr>
+          <w:p>
+            <w:pPr>
+              <w:spacing w:after="20"/>
+            </w:pPr>
+            <w:r/>
+            <w:r>
+              <w:rPr>
+                <w:b w:val="0"/>
+                <w:color w:val="131B2E"/>
+                <w:sz w:val="16"/>
+              </w:rPr>
+              <w:t>Salazar · asesores</w:t>
+            </w:r>
+          </w:p>
+        </w:tc>
+        <w:tc>
+          <w:tcPr>
+            <w:tcW w:type="dxa" w:w="1304"/>
+          </w:tcPr>
+          <w:p>
+            <w:pPr>
+              <w:spacing w:after="20"/>
+            </w:pPr>
+            <w:r/>
+            <w:r>
+              <w:rPr>
+                <w:b w:val="0"/>
+                <w:color w:val="131B2E"/>
+                <w:sz w:val="16"/>
+              </w:rPr>
+              <w:t>PLANIFICADA</w:t>
+            </w:r>
+          </w:p>
+        </w:tc>
       </w:tr>
       <w:tr>
         <w:tc>
           <w:tcPr>
-            <w:tcW w:type="dxa" w:w="2494"/>
+            <w:tcW w:type="dxa" w:w="1644"/>
+            <w:shd w:val="clear" w:fill="EEF3FA"/>
+          </w:tcPr>
+          <w:p>
+            <w:pPr>
+              <w:spacing w:after="20"/>
+            </w:pPr>
+            <w:r/>
+            <w:r>
+              <w:rPr>
+                <w:b w:val="0"/>
+                <w:color w:val="131B2E"/>
+                <w:sz w:val="16"/>
+              </w:rPr>
+            </w:r>
+            <w:r>
+              <w:rPr>
+                <w:b/>
+                <w:color w:val="131B2E"/>
+                <w:sz w:val="16"/>
+              </w:rPr>
+              <w:t>lun 28 sep 2026</w:t>
+            </w:r>
+            <w:r>
+              <w:rPr>
+                <w:b w:val="0"/>
+                <w:color w:val="131B2E"/>
+                <w:sz w:val="16"/>
+              </w:rPr>
+            </w:r>
+          </w:p>
+        </w:tc>
+        <w:tc>
+          <w:tcPr>
+            <w:tcW w:type="dxa" w:w="2268"/>
             <w:shd w:val="clear" w:fill="EEF3FA"/>
           </w:tcPr>
           <w:p>
@@ -3280,7 +3424,7 @@
         </w:tc>
         <w:tc>
           <w:tcPr>
-            <w:tcW w:type="dxa" w:w="3515"/>
+            <w:tcW w:type="dxa" w:w="3175"/>
             <w:shd w:val="clear" w:fill="EEF3FA"/>
           </w:tcPr>
           <w:p>
@@ -3300,7 +3444,7 @@
         </w:tc>
         <w:tc>
           <w:tcPr>
-            <w:tcW w:type="dxa" w:w="1644"/>
+            <w:tcW w:type="dxa" w:w="1361"/>
             <w:shd w:val="clear" w:fill="EEF3FA"/>
           </w:tcPr>
           <w:p>
@@ -3320,8 +3464,29 @@
         </w:tc>
         <w:tc>
           <w:tcPr>
-            <w:tcW w:type="dxa" w:w="1417"/>
+            <w:tcW w:type="dxa" w:w="1304"/>
             <w:shd w:val="clear" w:fill="EEF3FA"/>
+          </w:tcPr>
+          <w:p>
+            <w:pPr>
+              <w:spacing w:after="20"/>
+            </w:pPr>
+            <w:r/>
+            <w:r>
+              <w:rPr>
+                <w:b w:val="0"/>
+                <w:color w:val="131B2E"/>
+                <w:sz w:val="16"/>
+              </w:rPr>
+              <w:t>PLANIFICADA</w:t>
+            </w:r>
+          </w:p>
+        </w:tc>
+      </w:tr>
+      <w:tr>
+        <w:tc>
+          <w:tcPr>
+            <w:tcW w:type="dxa" w:w="1644"/>
           </w:tcPr>
           <w:p>
             <w:pPr>
@@ -3341,7 +3506,7 @@
                 <w:color w:val="131B2E"/>
                 <w:sz w:val="16"/>
               </w:rPr>
-              <w:t>lun 28 sep</w:t>
+              <w:t>sáb 10 oct 2026</w:t>
             </w:r>
             <w:r>
               <w:rPr>
@@ -3352,11 +3517,9 @@
             </w:r>
           </w:p>
         </w:tc>
-      </w:tr>
-      <w:tr>
         <w:tc>
           <w:tcPr>
-            <w:tcW w:type="dxa" w:w="2494"/>
+            <w:tcW w:type="dxa" w:w="2268"/>
           </w:tcPr>
           <w:p>
             <w:pPr>
@@ -3389,7 +3552,7 @@
         </w:tc>
         <w:tc>
           <w:tcPr>
-            <w:tcW w:type="dxa" w:w="3515"/>
+            <w:tcW w:type="dxa" w:w="3175"/>
           </w:tcPr>
           <w:p>
             <w:pPr>
@@ -3408,7 +3571,7 @@
         </w:tc>
         <w:tc>
           <w:tcPr>
-            <w:tcW w:type="dxa" w:w="1644"/>
+            <w:tcW w:type="dxa" w:w="1361"/>
           </w:tcPr>
           <w:p>
             <w:pPr>
@@ -3427,7 +3590,7 @@
         </w:tc>
         <w:tc>
           <w:tcPr>
-            <w:tcW w:type="dxa" w:w="1417"/>
+            <w:tcW w:type="dxa" w:w="1304"/>
           </w:tcPr>
           <w:p>
             <w:pPr>
@@ -3440,21 +3603,7 @@
                 <w:color w:val="131B2E"/>
                 <w:sz w:val="16"/>
               </w:rPr>
-            </w:r>
-            <w:r>
-              <w:rPr>
-                <w:b/>
-                <w:color w:val="131B2E"/>
-                <w:sz w:val="16"/>
-              </w:rPr>
-              <w:t>sáb 10 oct</w:t>
-            </w:r>
-            <w:r>
-              <w:rPr>
-                <w:b w:val="0"/>
-                <w:color w:val="131B2E"/>
-                <w:sz w:val="16"/>
-              </w:rPr>
+              <w:t>PLANIFICADA</w:t>
             </w:r>
           </w:p>
         </w:tc>
@@ -3462,67 +3611,7 @@
       <w:tr>
         <w:tc>
           <w:tcPr>
-            <w:tcW w:type="dxa" w:w="2494"/>
-            <w:shd w:val="clear" w:fill="EEF3FA"/>
-          </w:tcPr>
-          <w:p>
-            <w:pPr>
-              <w:spacing w:after="20"/>
-            </w:pPr>
-            <w:r/>
-            <w:r>
-              <w:rPr>
-                <w:b w:val="0"/>
-                <w:color w:val="131B2E"/>
-                <w:sz w:val="16"/>
-              </w:rPr>
-              <w:t>*Holdout* temporal externo</w:t>
-            </w:r>
-          </w:p>
-        </w:tc>
-        <w:tc>
-          <w:tcPr>
-            <w:tcW w:type="dxa" w:w="3515"/>
-            <w:shd w:val="clear" w:fill="EEF3FA"/>
-          </w:tcPr>
-          <w:p>
-            <w:pPr>
-              <w:spacing w:after="20"/>
-            </w:pPr>
-            <w:r/>
-            <w:r>
-              <w:rPr>
-                <w:b w:val="0"/>
-                <w:color w:val="131B2E"/>
-                <w:sz w:val="16"/>
-              </w:rPr>
-              <w:t>Campaña completa en fecha distinta, sin reutilizar episodios</w:t>
-            </w:r>
-          </w:p>
-        </w:tc>
-        <w:tc>
-          <w:tcPr>
             <w:tcW w:type="dxa" w:w="1644"/>
-            <w:shd w:val="clear" w:fill="EEF3FA"/>
-          </w:tcPr>
-          <w:p>
-            <w:pPr>
-              <w:spacing w:after="20"/>
-            </w:pPr>
-            <w:r/>
-            <w:r>
-              <w:rPr>
-                <w:b w:val="0"/>
-                <w:color w:val="131B2E"/>
-                <w:sz w:val="16"/>
-              </w:rPr>
-              <w:t>Salazar · Sauñe</w:t>
-            </w:r>
-          </w:p>
-        </w:tc>
-        <w:tc>
-          <w:tcPr>
-            <w:tcW w:type="dxa" w:w="1417"/>
             <w:shd w:val="clear" w:fill="EEF3FA"/>
           </w:tcPr>
           <w:p>
@@ -3543,7 +3632,7 @@
                 <w:color w:val="131B2E"/>
                 <w:sz w:val="16"/>
               </w:rPr>
-              <w:t>sáb 24 oct</w:t>
+              <w:t>sáb 24 oct 2026</w:t>
             </w:r>
             <w:r>
               <w:rPr>
@@ -3551,6 +3640,86 @@
                 <w:color w:val="131B2E"/>
                 <w:sz w:val="16"/>
               </w:rPr>
+            </w:r>
+          </w:p>
+        </w:tc>
+        <w:tc>
+          <w:tcPr>
+            <w:tcW w:type="dxa" w:w="2268"/>
+            <w:shd w:val="clear" w:fill="EEF3FA"/>
+          </w:tcPr>
+          <w:p>
+            <w:pPr>
+              <w:spacing w:after="20"/>
+            </w:pPr>
+            <w:r/>
+            <w:r>
+              <w:rPr>
+                <w:b w:val="0"/>
+                <w:color w:val="131B2E"/>
+                <w:sz w:val="16"/>
+              </w:rPr>
+              <w:t>*Holdout* temporal externo</w:t>
+            </w:r>
+          </w:p>
+        </w:tc>
+        <w:tc>
+          <w:tcPr>
+            <w:tcW w:type="dxa" w:w="3175"/>
+            <w:shd w:val="clear" w:fill="EEF3FA"/>
+          </w:tcPr>
+          <w:p>
+            <w:pPr>
+              <w:spacing w:after="20"/>
+            </w:pPr>
+            <w:r/>
+            <w:r>
+              <w:rPr>
+                <w:b w:val="0"/>
+                <w:color w:val="131B2E"/>
+                <w:sz w:val="16"/>
+              </w:rPr>
+              <w:t>Campaña completa en fecha distinta, sin reutilizar episodios</w:t>
+            </w:r>
+          </w:p>
+        </w:tc>
+        <w:tc>
+          <w:tcPr>
+            <w:tcW w:type="dxa" w:w="1361"/>
+            <w:shd w:val="clear" w:fill="EEF3FA"/>
+          </w:tcPr>
+          <w:p>
+            <w:pPr>
+              <w:spacing w:after="20"/>
+            </w:pPr>
+            <w:r/>
+            <w:r>
+              <w:rPr>
+                <w:b w:val="0"/>
+                <w:color w:val="131B2E"/>
+                <w:sz w:val="16"/>
+              </w:rPr>
+              <w:t>Salazar · Sauñe</w:t>
+            </w:r>
+          </w:p>
+        </w:tc>
+        <w:tc>
+          <w:tcPr>
+            <w:tcW w:type="dxa" w:w="1304"/>
+            <w:shd w:val="clear" w:fill="EEF3FA"/>
+          </w:tcPr>
+          <w:p>
+            <w:pPr>
+              <w:spacing w:after="20"/>
+            </w:pPr>
+            <w:r/>
+            <w:r>
+              <w:rPr>
+                <w:b w:val="0"/>
+                <w:color w:val="131B2E"/>
+                <w:sz w:val="16"/>
+              </w:rPr>
+              <w:t>PLANIFICADA</w:t>
             </w:r>
           </w:p>
         </w:tc>
@@ -3653,7 +3822,7 @@
           <w:color w:val="1F4E79"/>
           <w:sz w:val="25"/>
         </w:rPr>
-        <w:t>4 ·  Amenazas a la validez (*Threats to Validity*)</w:t>
+        <w:t>5 ·  Amenazas a la validez (*Threats to Validity*)</w:t>
       </w:r>
     </w:p>
     <w:p>
@@ -4155,7 +4324,7 @@
           <w:color w:val="1F4E79"/>
           <w:sz w:val="25"/>
         </w:rPr>
-        <w:t>5 ·  Conclusión</w:t>
+        <w:t>6 ·  Conclusión</w:t>
       </w:r>
     </w:p>
     <w:p>

</xml_diff>

<commit_message>
fix(informe): recorta el parrafo de riesgos para no rozar el limite de 4 pp
Co-Authored-By: Claude Opus 5 <noreply@anthropic.com>
Claude-Session: https://claude.ai/code/session_0118CSEqQvxD2LbN5hkqoZC6
</commit_message>
<xml_diff>
--- a/docs/entregables/01-evaluacion-critica/Informe-evaluacion-critica.docx
+++ b/docs/entregables/01-evaluacion-critica/Informe-evaluacion-critica.docx
@@ -2871,7 +2871,7 @@
           <w:color w:val="5B6B8C"/>
           <w:sz w:val="17"/>
         </w:rPr>
-        <w:t>Dos riesgos declarados de este cronograma.</w:t>
+        <w:t>Dos riesgos declarados.</w:t>
       </w:r>
       <w:r>
         <w:rPr>
@@ -2880,7 +2880,7 @@
           <w:color w:val="5B6B8C"/>
           <w:sz w:val="17"/>
         </w:rPr>
-        <w:t xml:space="preserve"> Primero, el envío deja solo </w:t>
+        <w:t xml:space="preserve"> El envío deja </w:t>
       </w:r>
       <w:r>
         <w:rPr>
@@ -2898,7 +2898,7 @@
           <w:color w:val="5B6B8C"/>
           <w:sz w:val="17"/>
         </w:rPr>
-        <w:t xml:space="preserve"> antes de que suba el APC: si se retrasa, el sobrecoste de USD 100 lo asume la universidad. Segundo, </w:t>
+        <w:t xml:space="preserve"> antes de que suba el APC. Y </w:t>
       </w:r>
       <w:r>
         <w:rPr>
@@ -2916,7 +2916,7 @@
           <w:color w:val="5B6B8C"/>
           <w:sz w:val="17"/>
         </w:rPr>
-        <w:t xml:space="preserve"> —el 10 y el 24 de octubre— y por tanto mientras el artículo está en revisión. Es deliberado: el artículo se escribe con el resultado ya bloqueado, que no va a cambiar, y las mejoras posteriores se declaran como trabajo en curso.</w:t>
+        <w:t>, con el artículo ya en revisión: es deliberado, porque el artículo se escribe con el resultado ya bloqueado.</w:t>
       </w:r>
     </w:p>
     <w:tbl>

</xml_diff>